<commit_message>
update template_berita_acara.docx with revised formatting and content placeholders
</commit_message>
<xml_diff>
--- a/public/template_berita_acara.docx
+++ b/public/template_berita_acara.docx
@@ -1,6 +1,6 @@
 
 <file path=word/document.xml><?xml version="1.0" encoding="utf-8"?>
-<w:document xmlns:wpc="http://schemas.microsoft.com/office/word/2010/wordprocessingCanvas" xmlns:cx="http://schemas.microsoft.com/office/drawing/2014/chartex" xmlns:cx1="http://schemas.microsoft.com/office/drawing/2015/9/8/chartex" xmlns:cx2="http://schemas.microsoft.com/office/drawing/2015/10/21/chartex" xmlns:cx3="http://schemas.microsoft.com/office/drawing/2016/5/9/chartex" xmlns:cx4="http://schemas.microsoft.com/office/drawing/2016/5/10/chartex" xmlns:cx5="http://schemas.microsoft.com/office/drawing/2016/5/11/chartex" xmlns:cx6="http://schemas.microsoft.com/office/drawing/2016/5/12/chartex" xmlns:cx7="http://schemas.microsoft.com/office/drawing/2016/5/13/chartex" xmlns:cx8="http://schemas.microsoft.com/office/drawing/2016/5/14/chartex" xmlns:mc="http://schemas.openxmlformats.org/markup-compatibility/2006" xmlns:aink="http://schemas.microsoft.com/office/drawing/2016/ink" xmlns:am3d="http://schemas.microsoft.com/office/drawing/2017/model3d" xmlns:o="urn:schemas-microsoft-com:office:office" xmlns:oel="http://schemas.microsoft.com/office/2019/extlst" xmlns:r="http://schemas.openxmlformats.org/officeDocument/2006/relationships" xmlns:m="http://schemas.openxmlformats.org/officeDocument/2006/math" xmlns:v="urn:schemas-microsoft-com:vml" xmlns:wp14="http://schemas.microsoft.com/office/word/2010/wordprocessingDrawing" xmlns:wp="http://schemas.openxmlformats.org/drawingml/2006/wordprocessingDrawing" xmlns:w10="urn:schemas-microsoft-com:office:word" xmlns:w="http://schemas.openxmlformats.org/wordprocessingml/2006/main" xmlns:w14="http://schemas.microsoft.com/office/word/2010/wordml" xmlns:w15="http://schemas.microsoft.com/office/word/2012/wordml" xmlns:w16cex="http://schemas.microsoft.com/office/word/2018/wordml/cex" xmlns:w16cid="http://schemas.microsoft.com/office/word/2016/wordml/cid" xmlns:w16="http://schemas.microsoft.com/office/word/2018/wordml" xmlns:w16du="http://schemas.microsoft.com/office/word/2023/wordml/word16du" xmlns:w16sdtdh="http://schemas.microsoft.com/office/word/2020/wordml/sdtdatahash" xmlns:w16sdtfl="http://schemas.microsoft.com/office/word/2024/wordml/sdtformatlock" xmlns:w16se="http://schemas.microsoft.com/office/word/2015/wordml/symex" xmlns:wpg="http://schemas.microsoft.com/office/word/2010/wordprocessingGroup" xmlns:wpi="http://schemas.microsoft.com/office/word/2010/wordprocessingInk" xmlns:wne="http://schemas.microsoft.com/office/word/2006/wordml" xmlns:wps="http://schemas.microsoft.com/office/word/2010/wordprocessingShape" mc:Ignorable="w14 w15 w16se w16cid w16 w16cex w16sdtdh w16sdtfl w16du wp14">
+<w:document xmlns:wpc="http://schemas.microsoft.com/office/word/2010/wordprocessingCanvas" xmlns:cx="http://schemas.microsoft.com/office/drawing/2014/chartex" xmlns:cx1="http://schemas.microsoft.com/office/drawing/2015/9/8/chartex" xmlns:cx2="http://schemas.microsoft.com/office/drawing/2015/10/21/chartex" xmlns:cx3="http://schemas.microsoft.com/office/drawing/2016/5/9/chartex" xmlns:cx4="http://schemas.microsoft.com/office/drawing/2016/5/10/chartex" xmlns:cx5="http://schemas.microsoft.com/office/drawing/2016/5/11/chartex" xmlns:cx6="http://schemas.microsoft.com/office/drawing/2016/5/12/chartex" xmlns:cx7="http://schemas.microsoft.com/office/drawing/2016/5/13/chartex" xmlns:cx8="http://schemas.microsoft.com/office/drawing/2016/5/14/chartex" xmlns:mc="http://schemas.openxmlformats.org/markup-compatibility/2006" xmlns:m="http://schemas.openxmlformats.org/officeDocument/2006/math" xmlns:aink="http://schemas.microsoft.com/office/drawing/2016/ink" xmlns:am3d="http://schemas.microsoft.com/office/drawing/2017/model3d" xmlns:oel="http://schemas.microsoft.com/office/2019/extlst" xmlns:r="http://schemas.openxmlformats.org/officeDocument/2006/relationships" xmlns:wp14="http://schemas.microsoft.com/office/word/2010/wordprocessingDrawing" xmlns:wp="http://schemas.openxmlformats.org/drawingml/2006/wordprocessingDrawing" xmlns:wpg="http://schemas.microsoft.com/office/word/2010/wordprocessingGroup" xmlns:wpi="http://schemas.microsoft.com/office/word/2010/wordprocessingInk" xmlns:wps="http://schemas.microsoft.com/office/word/2010/wordprocessingShape" xmlns:o="urn:schemas-microsoft-com:office:office" xmlns:v="urn:schemas-microsoft-com:vml" xmlns:w10="urn:schemas-microsoft-com:office:word" xmlns:w="http://schemas.openxmlformats.org/wordprocessingml/2006/main" xmlns:w14="http://schemas.microsoft.com/office/word/2010/wordml" xmlns:w15="http://schemas.microsoft.com/office/word/2012/wordml" xmlns:w16cei="http://schemas.microsoft.com/office/word/2026/wordml/cei" xmlns:w16cex="http://schemas.microsoft.com/office/word/2018/wordml/cex" xmlns:w16cid="http://schemas.microsoft.com/office/word/2016/wordml/cid" xmlns:w16="http://schemas.microsoft.com/office/word/2018/wordml" xmlns:w16sdtdh="http://schemas.microsoft.com/office/word/2020/wordml/sdtdatahash" xmlns:w16sdtfl="http://schemas.microsoft.com/office/word/2024/wordml/sdtformatlock" xmlns:w16se="http://schemas.microsoft.com/office/word/2015/wordml/symex" xmlns:w16du="http://schemas.microsoft.com/office/word/2023/wordml/word16du" xmlns:wne="http://schemas.microsoft.com/office/word/2006/wordml" mc:Ignorable="w14 w15 w16se w16cid w16 w16cex w16sdtdh w16sdtfl w16du wp14">
   <w:body>
     <w:p>
       <w:pPr>
@@ -32,7 +32,7 @@
           <w:lang w:eastAsia="id-ID"/>
         </w:rPr>
         <w:drawing>
-          <wp:inline distT="0" distB="0" distL="0" distR="0" wp14:anchorId="64B94AB8" wp14:editId="2A79AF62">
+          <wp:inline distT="0" distB="0" distL="0" distR="0" wp14:anchorId="64B94AB8" wp14:editId="11409EA3">
             <wp:extent cx="890270" cy="688340"/>
             <wp:effectExtent l="0" t="0" r="5080" b="0"/>
             <wp:docPr id="1614375618" name="Picture 1"/>
@@ -145,56 +145,113 @@
       <w:r>
         <w:rPr>
           <w:rFonts w:ascii="Arial Narrow" w:hAnsi="Arial Narrow" w:cs="Arial"/>
+          <w:color w:val="000000" w:themeColor="text1"/>
         </w:rPr>
         <w:t xml:space="preserve">Pada hari ini, </w:t>
       </w:r>
       <w:r>
         <w:rPr>
           <w:rFonts w:ascii="Arial Narrow" w:hAnsi="Arial Narrow" w:cs="Arial"/>
-          <w:color w:val="FF0000"/>
-        </w:rPr>
-        <w:t xml:space="preserve">${hari_penyebut} </w:t>
-      </w:r>
-      <w:r>
-        <w:rPr>
-          <w:rFonts w:ascii="Arial Narrow" w:hAnsi="Arial Narrow" w:cs="Arial"/>
-          <w:color w:val="FF0000"/>
+          <w:color w:val="000000" w:themeColor="text1"/>
+        </w:rPr>
+        <w:t>${hari_</w:t>
+      </w:r>
+      <w:r>
+        <w:rPr>
+          <w:rFonts w:ascii="Arial Narrow" w:hAnsi="Arial Narrow" w:cs="Arial"/>
+          <w:color w:val="000000" w:themeColor="text1"/>
+        </w:rPr>
+        <w:t>surat</w:t>
+      </w:r>
+      <w:r>
+        <w:rPr>
+          <w:rFonts w:ascii="Arial Narrow" w:hAnsi="Arial Narrow" w:cs="Arial"/>
+          <w:color w:val="000000" w:themeColor="text1"/>
+        </w:rPr>
+        <w:t xml:space="preserve">} </w:t>
+      </w:r>
+      <w:r>
+        <w:rPr>
+          <w:rFonts w:ascii="Arial Narrow" w:hAnsi="Arial Narrow" w:cs="Arial"/>
+          <w:color w:val="000000" w:themeColor="text1"/>
         </w:rPr>
         <w:t xml:space="preserve">Tanggal </w:t>
       </w:r>
       <w:r>
         <w:rPr>
           <w:rFonts w:ascii="Arial Narrow" w:hAnsi="Arial Narrow" w:cs="Arial"/>
-          <w:color w:val="FF0000"/>
-        </w:rPr>
-        <w:t>${tanggal_penyebut}</w:t>
-      </w:r>
-      <w:r>
-        <w:rPr>
-          <w:rFonts w:ascii="Arial Narrow" w:hAnsi="Arial Narrow" w:cs="Arial"/>
-          <w:color w:val="FF0000"/>
+          <w:color w:val="000000" w:themeColor="text1"/>
+        </w:rPr>
+        <w:t>${tanggal_</w:t>
+      </w:r>
+      <w:r>
+        <w:rPr>
+          <w:rFonts w:ascii="Arial Narrow" w:hAnsi="Arial Narrow" w:cs="Arial"/>
+          <w:color w:val="000000" w:themeColor="text1"/>
+        </w:rPr>
+        <w:t>surat</w:t>
+      </w:r>
+      <w:r>
+        <w:rPr>
+          <w:rFonts w:ascii="Arial Narrow" w:hAnsi="Arial Narrow" w:cs="Arial"/>
+          <w:color w:val="000000" w:themeColor="text1"/>
+        </w:rPr>
+        <w:t>}</w:t>
+      </w:r>
+      <w:r>
+        <w:rPr>
+          <w:rFonts w:ascii="Arial Narrow" w:hAnsi="Arial Narrow" w:cs="Arial"/>
+          <w:color w:val="000000" w:themeColor="text1"/>
         </w:rPr>
         <w:t xml:space="preserve">, Pukul </w:t>
       </w:r>
       <w:r>
         <w:rPr>
           <w:rFonts w:ascii="Arial Narrow" w:hAnsi="Arial Narrow" w:cs="Arial"/>
-          <w:color w:val="FF0000"/>
-        </w:rPr>
-        <w:t>${pukul_penyebut}</w:t>
-      </w:r>
-      <w:r>
-        <w:rPr>
-          <w:rFonts w:ascii="Arial Narrow" w:hAnsi="Arial Narrow" w:cs="Arial"/>
-          <w:color w:val="FF0000"/>
-        </w:rPr>
-        <w:t xml:space="preserve"> Waktu Indonesia Barat</w:t>
-      </w:r>
-      <w:r>
-        <w:rPr>
-          <w:rFonts w:ascii="Arial Narrow" w:hAnsi="Arial Narrow" w:cs="Arial"/>
-        </w:rPr>
-        <w:t xml:space="preserve">, telah diselenggarakan visitasi dalam rangka verifikasi data </w:t>
+          <w:color w:val="000000" w:themeColor="text1"/>
+        </w:rPr>
+        <w:t>${</w:t>
+      </w:r>
+      <w:r>
+        <w:rPr>
+          <w:rFonts w:ascii="Arial Narrow" w:hAnsi="Arial Narrow" w:cs="Arial"/>
+          <w:color w:val="000000" w:themeColor="text1"/>
+        </w:rPr>
+        <w:t>waktu_surat</w:t>
+      </w:r>
+      <w:r>
+        <w:rPr>
+          <w:rFonts w:ascii="Arial Narrow" w:hAnsi="Arial Narrow" w:cs="Arial"/>
+          <w:color w:val="000000" w:themeColor="text1"/>
+        </w:rPr>
+        <w:t>}</w:t>
+      </w:r>
+      <w:r>
+        <w:rPr>
+          <w:rFonts w:ascii="Arial Narrow" w:hAnsi="Arial Narrow" w:cs="Arial"/>
+          <w:color w:val="000000" w:themeColor="text1"/>
+        </w:rPr>
+        <w:t xml:space="preserve"> </w:t>
+      </w:r>
+      <w:r>
+        <w:rPr>
+          <w:rFonts w:ascii="Arial Narrow" w:hAnsi="Arial Narrow" w:cs="Arial"/>
+          <w:color w:val="000000" w:themeColor="text1"/>
+        </w:rPr>
+        <w:t>${zona_surat}</w:t>
+      </w:r>
+      <w:r>
+        <w:rPr>
+          <w:rFonts w:ascii="Arial Narrow" w:hAnsi="Arial Narrow" w:cs="Arial"/>
+          <w:color w:val="000000" w:themeColor="text1"/>
+        </w:rPr>
+        <w:t>,</w:t>
+      </w:r>
+      <w:r>
+        <w:rPr>
+          <w:rFonts w:ascii="Arial Narrow" w:hAnsi="Arial Narrow" w:cs="Arial"/>
+        </w:rPr>
+        <w:t xml:space="preserve"> telah diselenggarakan visitasi dalam rangka verifikasi data </w:t>
       </w:r>
       <w:r>
         <w:rPr>
@@ -703,11 +760,17 @@
           <w:p>
             <w:pPr>
               <w:spacing w:after="0"/>
-              <w:jc w:val="both"/>
+              <w:jc w:val="center"/>
               <w:rPr>
                 <w:rFonts w:ascii="Arial Narrow" w:hAnsi="Arial Narrow" w:cs="Arial"/>
               </w:rPr>
             </w:pPr>
+            <w:r>
+              <w:rPr>
+                <w:rFonts w:ascii="Arial Narrow" w:hAnsi="Arial Narrow" w:cs="Arial"/>
+              </w:rPr>
+              <w:t>${ttd_asesor1}</w:t>
+            </w:r>
           </w:p>
           <w:p>
             <w:pPr>
@@ -768,12 +831,18 @@
               <w:rPr>
                 <w:rFonts w:ascii="Arial Narrow" w:hAnsi="Arial Narrow" w:cs="Arial"/>
               </w:rPr>
-              <w:t>Jakarta,</w:t>
+              <w:t>${tempat_surat}</w:t>
             </w:r>
             <w:r>
               <w:rPr>
                 <w:rFonts w:ascii="Arial Narrow" w:hAnsi="Arial Narrow" w:cs="Arial"/>
               </w:rPr>
+              <w:t>,</w:t>
+            </w:r>
+            <w:r>
+              <w:rPr>
+                <w:rFonts w:ascii="Arial Narrow" w:hAnsi="Arial Narrow" w:cs="Arial"/>
+              </w:rPr>
               <w:t xml:space="preserve"> </w:t>
             </w:r>
             <w:r>
@@ -824,6 +893,24 @@
                 <w:rFonts w:ascii="Arial Narrow" w:hAnsi="Arial Narrow" w:cs="Arial"/>
               </w:rPr>
             </w:pPr>
+            <w:r>
+              <w:rPr>
+                <w:rFonts w:ascii="Arial Narrow" w:hAnsi="Arial Narrow" w:cs="Arial"/>
+              </w:rPr>
+              <w:t>${ttd_</w:t>
+            </w:r>
+            <w:r>
+              <w:rPr>
+                <w:rFonts w:ascii="Arial Narrow" w:hAnsi="Arial Narrow" w:cs="Arial"/>
+              </w:rPr>
+              <w:t>kepala</w:t>
+            </w:r>
+            <w:r>
+              <w:rPr>
+                <w:rFonts w:ascii="Arial Narrow" w:hAnsi="Arial Narrow" w:cs="Arial"/>
+              </w:rPr>
+              <w:t>}</w:t>
+            </w:r>
           </w:p>
           <w:p>
             <w:pPr>
@@ -886,170 +973,244 @@
         <w:t>Anggota :</w:t>
       </w:r>
     </w:p>
-    <w:p>
-      <w:pPr>
-        <w:rPr>
-          <w:rFonts w:ascii="Arial Narrow" w:eastAsia="Arial Narrow" w:hAnsi="Arial Narrow" w:cs="Arial Narrow"/>
-        </w:rPr>
-      </w:pPr>
-    </w:p>
-    <w:p>
-      <w:pPr>
-        <w:numPr>
-          <w:ilvl w:val="0"/>
-          <w:numId w:val="10"/>
-        </w:numPr>
-        <w:pBdr>
-          <w:top w:val="nil"/>
-          <w:left w:val="nil"/>
-          <w:bottom w:val="nil"/>
-          <w:right w:val="nil"/>
-          <w:between w:val="nil"/>
-        </w:pBdr>
-        <w:rPr>
-          <w:rFonts w:ascii="Arial Narrow" w:hAnsi="Arial Narrow"/>
-        </w:rPr>
-      </w:pPr>
-      <w:r>
-        <w:rPr>
-          <w:rFonts w:ascii="Arial Narrow" w:hAnsi="Arial Narrow"/>
-        </w:rPr>
-        <w:t>${nama_asesor2}</w:t>
-      </w:r>
-      <w:r>
-        <w:rPr>
-          <w:rFonts w:ascii="Arial Narrow" w:hAnsi="Arial Narrow"/>
-        </w:rPr>
-        <w:tab/>
-      </w:r>
-      <w:r>
-        <w:rPr>
-          <w:rFonts w:ascii="Arial Narrow" w:eastAsia="Arial Narrow" w:hAnsi="Arial Narrow" w:cs="Arial Narrow"/>
-        </w:rPr>
-        <w:t xml:space="preserve"> </w:t>
-      </w:r>
-      <w:r>
-        <w:rPr>
-          <w:rFonts w:ascii="Arial Narrow" w:eastAsia="Arial Narrow" w:hAnsi="Arial Narrow" w:cs="Arial Narrow"/>
-        </w:rPr>
-        <w:tab/>
-      </w:r>
-      <w:r>
-        <w:rPr>
-          <w:rFonts w:ascii="Arial Narrow" w:eastAsia="Arial Narrow" w:hAnsi="Arial Narrow" w:cs="Arial Narrow"/>
-        </w:rPr>
-        <w:tab/>
-      </w:r>
-      <w:r>
-        <w:rPr>
-          <w:rFonts w:ascii="Arial Narrow" w:eastAsia="Arial Narrow" w:hAnsi="Arial Narrow" w:cs="Arial Narrow"/>
-        </w:rPr>
-        <w:tab/>
-        <w:t>(</w:t>
-      </w:r>
-      <w:r>
-        <w:rPr>
-          <w:rFonts w:ascii="Arial Narrow" w:eastAsia="Arial Narrow" w:hAnsi="Arial Narrow" w:cs="Arial Narrow"/>
-        </w:rPr>
-        <w:tab/>
-        <w:t xml:space="preserve">                                      )</w:t>
-      </w:r>
-    </w:p>
-    <w:p>
-      <w:pPr>
-        <w:pBdr>
-          <w:top w:val="nil"/>
-          <w:left w:val="nil"/>
-          <w:bottom w:val="nil"/>
-          <w:right w:val="nil"/>
-          <w:between w:val="nil"/>
-        </w:pBdr>
-        <w:ind w:left="1080"/>
-        <w:rPr>
-          <w:rFonts w:ascii="Arial Narrow" w:eastAsia="Arial Narrow" w:hAnsi="Arial Narrow" w:cs="Arial Narrow"/>
-        </w:rPr>
-      </w:pPr>
-    </w:p>
-    <w:p>
-      <w:pPr>
-        <w:pStyle w:val="ListParagraph"/>
-        <w:numPr>
-          <w:ilvl w:val="0"/>
-          <w:numId w:val="10"/>
-        </w:numPr>
-        <w:spacing w:after="0" w:line="240" w:lineRule="auto"/>
-        <w:rPr>
-          <w:rFonts w:ascii="Arial Narrow" w:hAnsi="Arial Narrow"/>
-          <w:b/>
-        </w:rPr>
-      </w:pPr>
-      <w:r>
-        <w:rPr>
-          <w:rFonts w:ascii="Arial Narrow" w:hAnsi="Arial Narrow"/>
-        </w:rPr>
-        <w:t>${nama_asesor3}</w:t>
-      </w:r>
-      <w:r>
-        <w:rPr>
-          <w:rFonts w:ascii="Arial Narrow" w:eastAsia="Arial Narrow" w:hAnsi="Arial Narrow" w:cs="Arial Narrow"/>
-        </w:rPr>
-        <w:tab/>
-      </w:r>
-      <w:r>
-        <w:rPr>
-          <w:rFonts w:ascii="Arial Narrow" w:eastAsia="Arial Narrow" w:hAnsi="Arial Narrow" w:cs="Arial Narrow"/>
-        </w:rPr>
-        <w:tab/>
-        <w:t xml:space="preserve"> </w:t>
-      </w:r>
-      <w:r>
-        <w:rPr>
-          <w:rFonts w:ascii="Arial Narrow" w:eastAsia="Arial Narrow" w:hAnsi="Arial Narrow" w:cs="Arial Narrow"/>
-        </w:rPr>
-        <w:tab/>
-      </w:r>
-      <w:r>
-        <w:rPr>
-          <w:rFonts w:ascii="Arial Narrow" w:eastAsia="Arial Narrow" w:hAnsi="Arial Narrow" w:cs="Arial Narrow"/>
-        </w:rPr>
-        <w:tab/>
-        <w:t>(</w:t>
-      </w:r>
-      <w:r>
-        <w:rPr>
-          <w:rFonts w:ascii="Arial Narrow" w:eastAsia="Arial Narrow" w:hAnsi="Arial Narrow" w:cs="Arial Narrow"/>
-        </w:rPr>
-        <w:tab/>
-      </w:r>
-      <w:r>
-        <w:rPr>
-          <w:rFonts w:ascii="Arial Narrow" w:eastAsia="Arial Narrow" w:hAnsi="Arial Narrow" w:cs="Arial Narrow"/>
-        </w:rPr>
-        <w:tab/>
-      </w:r>
-      <w:r>
-        <w:rPr>
-          <w:rFonts w:ascii="Arial Narrow" w:eastAsia="Arial Narrow" w:hAnsi="Arial Narrow" w:cs="Arial Narrow"/>
-        </w:rPr>
-        <w:tab/>
-        <w:t xml:space="preserve">         </w:t>
-      </w:r>
-      <w:bookmarkStart w:id="2" w:name="_heading=h.gjdgxs" w:colFirst="0" w:colLast="0"/>
-      <w:bookmarkEnd w:id="2"/>
-      <w:r>
-        <w:rPr>
-          <w:rFonts w:ascii="Arial Narrow" w:eastAsia="Arial Narrow" w:hAnsi="Arial Narrow" w:cs="Arial Narrow"/>
-        </w:rPr>
-        <w:t>)</w:t>
-      </w:r>
-      <w:r>
-        <w:rPr>
-          <w:rFonts w:ascii="Arial Narrow" w:hAnsi="Arial Narrow"/>
-          <w:b/>
-        </w:rPr>
-        <w:br w:type="page"/>
-      </w:r>
-    </w:p>
+    <w:tbl>
+      <w:tblPr>
+        <w:tblStyle w:val="TableGrid"/>
+        <w:tblW w:w="0" w:type="auto"/>
+        <w:tblBorders>
+          <w:top w:val="none" w:sz="0" w:space="0" w:color="auto"/>
+          <w:left w:val="none" w:sz="0" w:space="0" w:color="auto"/>
+          <w:bottom w:val="none" w:sz="0" w:space="0" w:color="auto"/>
+          <w:right w:val="none" w:sz="0" w:space="0" w:color="auto"/>
+          <w:insideH w:val="none" w:sz="0" w:space="0" w:color="auto"/>
+          <w:insideV w:val="none" w:sz="0" w:space="0" w:color="auto"/>
+        </w:tblBorders>
+        <w:tblLook w:val="04A0" w:firstRow="1" w:lastRow="0" w:firstColumn="1" w:lastColumn="0" w:noHBand="0" w:noVBand="1"/>
+      </w:tblPr>
+      <w:tblGrid>
+        <w:gridCol w:w="4508"/>
+        <w:gridCol w:w="4509"/>
+      </w:tblGrid>
+      <w:tr>
+        <w:tc>
+          <w:tcPr>
+            <w:tcW w:w="4508" w:type="dxa"/>
+            <w:vAlign w:val="center"/>
+          </w:tcPr>
+          <w:p>
+            <w:pPr>
+              <w:pStyle w:val="ListParagraph"/>
+              <w:numPr>
+                <w:ilvl w:val="0"/>
+                <w:numId w:val="30"/>
+              </w:numPr>
+              <w:jc w:val="center"/>
+              <w:rPr>
+                <w:rFonts w:ascii="Arial Narrow" w:eastAsia="Arial Narrow" w:hAnsi="Arial Narrow" w:cs="Arial Narrow"/>
+              </w:rPr>
+            </w:pPr>
+            <w:r>
+              <w:rPr>
+                <w:rFonts w:ascii="Arial Narrow" w:eastAsia="Arial Narrow" w:hAnsi="Arial Narrow" w:cs="Arial Narrow"/>
+              </w:rPr>
+              <w:t>${nama_asesor2}</w:t>
+            </w:r>
+          </w:p>
+        </w:tc>
+        <w:tc>
+          <w:tcPr>
+            <w:tcW w:w="4509" w:type="dxa"/>
+            <w:vAlign w:val="center"/>
+          </w:tcPr>
+          <w:p>
+            <w:pPr>
+              <w:jc w:val="center"/>
+              <w:rPr>
+                <w:rFonts w:ascii="Arial Narrow" w:eastAsia="Arial Narrow" w:hAnsi="Arial Narrow" w:cs="Arial Narrow"/>
+              </w:rPr>
+            </w:pPr>
+          </w:p>
+          <w:p>
+            <w:pPr>
+              <w:jc w:val="center"/>
+              <w:rPr>
+                <w:rFonts w:ascii="Arial Narrow" w:eastAsia="Arial Narrow" w:hAnsi="Arial Narrow" w:cs="Arial Narrow"/>
+              </w:rPr>
+            </w:pPr>
+            <w:r>
+              <w:rPr>
+                <w:rFonts w:ascii="Arial Narrow" w:eastAsia="Arial Narrow" w:hAnsi="Arial Narrow" w:cs="Arial Narrow"/>
+              </w:rPr>
+              <w:t>(</w:t>
+            </w:r>
+            <w:r>
+              <w:rPr>
+                <w:rFonts w:ascii="Arial Narrow" w:eastAsia="Arial Narrow" w:hAnsi="Arial Narrow" w:cs="Arial Narrow"/>
+              </w:rPr>
+              <w:tab/>
+            </w:r>
+            <w:r>
+              <w:rPr>
+                <w:rFonts w:ascii="Arial Narrow" w:eastAsia="Arial Narrow" w:hAnsi="Arial Narrow" w:cs="Arial Narrow"/>
+              </w:rPr>
+              <w:tab/>
+              <w:t>${ttd_asesor2}</w:t>
+            </w:r>
+            <w:r>
+              <w:rPr>
+                <w:rFonts w:ascii="Arial Narrow" w:eastAsia="Arial Narrow" w:hAnsi="Arial Narrow" w:cs="Arial Narrow"/>
+              </w:rPr>
+              <w:tab/>
+            </w:r>
+            <w:r>
+              <w:rPr>
+                <w:rFonts w:ascii="Arial Narrow" w:eastAsia="Arial Narrow" w:hAnsi="Arial Narrow" w:cs="Arial Narrow"/>
+              </w:rPr>
+              <w:tab/>
+            </w:r>
+            <w:r>
+              <w:rPr>
+                <w:rFonts w:ascii="Arial Narrow" w:eastAsia="Arial Narrow" w:hAnsi="Arial Narrow" w:cs="Arial Narrow"/>
+              </w:rPr>
+              <w:t>)</w:t>
+            </w:r>
+          </w:p>
+          <w:p>
+            <w:pPr>
+              <w:jc w:val="center"/>
+              <w:rPr>
+                <w:rFonts w:ascii="Arial Narrow" w:eastAsia="Arial Narrow" w:hAnsi="Arial Narrow" w:cs="Arial Narrow"/>
+              </w:rPr>
+            </w:pPr>
+          </w:p>
+        </w:tc>
+      </w:tr>
+      <w:tr>
+        <w:trPr>
+          <w:trHeight w:val="1340"/>
+        </w:trPr>
+        <w:tc>
+          <w:tcPr>
+            <w:tcW w:w="4508" w:type="dxa"/>
+            <w:vAlign w:val="center"/>
+          </w:tcPr>
+          <w:p>
+            <w:pPr>
+              <w:jc w:val="center"/>
+              <w:rPr>
+                <w:rFonts w:ascii="Arial Narrow" w:eastAsia="Arial Narrow" w:hAnsi="Arial Narrow" w:cs="Arial Narrow"/>
+                <w:b/>
+                <w:bCs/>
+              </w:rPr>
+            </w:pPr>
+          </w:p>
+          <w:p>
+            <w:pPr>
+              <w:pStyle w:val="ListParagraph"/>
+              <w:numPr>
+                <w:ilvl w:val="0"/>
+                <w:numId w:val="30"/>
+              </w:numPr>
+              <w:jc w:val="center"/>
+              <w:rPr>
+                <w:rFonts w:ascii="Arial Narrow" w:eastAsia="Arial Narrow" w:hAnsi="Arial Narrow" w:cs="Arial Narrow"/>
+                <w:b/>
+                <w:bCs/>
+              </w:rPr>
+            </w:pPr>
+            <w:r>
+              <w:rPr>
+                <w:rFonts w:ascii="Arial Narrow" w:eastAsia="Arial Narrow" w:hAnsi="Arial Narrow" w:cs="Arial Narrow"/>
+              </w:rPr>
+              <w:t>${nama_asesor</w:t>
+            </w:r>
+            <w:r>
+              <w:rPr>
+                <w:rFonts w:ascii="Arial Narrow" w:eastAsia="Arial Narrow" w:hAnsi="Arial Narrow" w:cs="Arial Narrow"/>
+              </w:rPr>
+              <w:t>3</w:t>
+            </w:r>
+            <w:r>
+              <w:rPr>
+                <w:rFonts w:ascii="Arial Narrow" w:eastAsia="Arial Narrow" w:hAnsi="Arial Narrow" w:cs="Arial Narrow"/>
+              </w:rPr>
+              <w:t>}</w:t>
+            </w:r>
+          </w:p>
+        </w:tc>
+        <w:tc>
+          <w:tcPr>
+            <w:tcW w:w="4509" w:type="dxa"/>
+            <w:vAlign w:val="center"/>
+          </w:tcPr>
+          <w:p>
+            <w:pPr>
+              <w:jc w:val="center"/>
+              <w:rPr>
+                <w:rFonts w:ascii="Arial Narrow" w:eastAsia="Arial Narrow" w:hAnsi="Arial Narrow" w:cs="Arial Narrow"/>
+              </w:rPr>
+            </w:pPr>
+          </w:p>
+          <w:p>
+            <w:pPr>
+              <w:jc w:val="center"/>
+              <w:rPr>
+                <w:rFonts w:ascii="Arial Narrow" w:eastAsia="Arial Narrow" w:hAnsi="Arial Narrow" w:cs="Arial Narrow"/>
+              </w:rPr>
+            </w:pPr>
+            <w:r>
+              <w:rPr>
+                <w:rFonts w:ascii="Arial Narrow" w:eastAsia="Arial Narrow" w:hAnsi="Arial Narrow" w:cs="Arial Narrow"/>
+              </w:rPr>
+              <w:t>(</w:t>
+            </w:r>
+            <w:r>
+              <w:rPr>
+                <w:rFonts w:ascii="Arial Narrow" w:eastAsia="Arial Narrow" w:hAnsi="Arial Narrow" w:cs="Arial Narrow"/>
+              </w:rPr>
+              <w:tab/>
+            </w:r>
+            <w:r>
+              <w:rPr>
+                <w:rFonts w:ascii="Arial Narrow" w:eastAsia="Arial Narrow" w:hAnsi="Arial Narrow" w:cs="Arial Narrow"/>
+              </w:rPr>
+              <w:tab/>
+              <w:t>${ttd_asesor</w:t>
+            </w:r>
+            <w:r>
+              <w:rPr>
+                <w:rFonts w:ascii="Arial Narrow" w:eastAsia="Arial Narrow" w:hAnsi="Arial Narrow" w:cs="Arial Narrow"/>
+              </w:rPr>
+              <w:t>3</w:t>
+            </w:r>
+            <w:r>
+              <w:rPr>
+                <w:rFonts w:ascii="Arial Narrow" w:eastAsia="Arial Narrow" w:hAnsi="Arial Narrow" w:cs="Arial Narrow"/>
+              </w:rPr>
+              <w:t>}</w:t>
+            </w:r>
+            <w:r>
+              <w:rPr>
+                <w:rFonts w:ascii="Arial Narrow" w:eastAsia="Arial Narrow" w:hAnsi="Arial Narrow" w:cs="Arial Narrow"/>
+              </w:rPr>
+              <w:tab/>
+            </w:r>
+            <w:r>
+              <w:rPr>
+                <w:rFonts w:ascii="Arial Narrow" w:eastAsia="Arial Narrow" w:hAnsi="Arial Narrow" w:cs="Arial Narrow"/>
+              </w:rPr>
+              <w:tab/>
+            </w:r>
+            <w:r>
+              <w:rPr>
+                <w:rFonts w:ascii="Arial Narrow" w:eastAsia="Arial Narrow" w:hAnsi="Arial Narrow" w:cs="Arial Narrow"/>
+              </w:rPr>
+              <w:t>)</w:t>
+            </w:r>
+          </w:p>
+        </w:tc>
+      </w:tr>
+    </w:tbl>
     <w:p>
       <w:pPr>
         <w:spacing w:after="0" w:line="240" w:lineRule="auto"/>
@@ -1112,15 +1273,8 @@
     <w:p>
       <w:pPr>
         <w:pStyle w:val="NormalWeb"/>
-        <w:spacing w:before="0" w:beforeAutospacing="0" w:after="200" w:afterAutospacing="0"/>
+        <w:spacing w:before="0" w:beforeAutospacing="0" w:after="0" w:afterAutospacing="0"/>
         <w:jc w:val="center"/>
-        <w:rPr>
-          <w:rFonts w:ascii="Arial Narrow" w:hAnsi="Arial Narrow"/>
-          <w:sz w:val="22"/>
-          <w:szCs w:val="22"/>
-        </w:rPr>
-      </w:pPr>
-      <w:r>
         <w:rPr>
           <w:rFonts w:ascii="Arial Narrow" w:hAnsi="Arial Narrow"/>
           <w:b/>
@@ -1128,8 +1282,7 @@
           <w:sz w:val="22"/>
           <w:szCs w:val="22"/>
         </w:rPr>
-        <w:t xml:space="preserve">Berdasarkan Observasi dan Wawancara dengan Pengelola dan Penyelenggara Akreditasi, </w:t>
-      </w:r>
+      </w:pPr>
       <w:r>
         <w:rPr>
           <w:rFonts w:ascii="Arial Narrow" w:hAnsi="Arial Narrow"/>
@@ -1138,9 +1291,14 @@
           <w:sz w:val="22"/>
           <w:szCs w:val="22"/>
         </w:rPr>
-        <w:t>Widyaiswara, Alumni</w:t>
-      </w:r>
-      <w:r>
+        <w:t xml:space="preserve">Berdasarkan Observasi dan Wawancara dengan Pengelola dan Penyelenggara Akreditasi, </w:t>
+      </w:r>
+    </w:p>
+    <w:p>
+      <w:pPr>
+        <w:pStyle w:val="NormalWeb"/>
+        <w:spacing w:before="0" w:beforeAutospacing="0" w:after="0" w:afterAutospacing="0"/>
+        <w:jc w:val="center"/>
         <w:rPr>
           <w:rFonts w:ascii="Arial Narrow" w:hAnsi="Arial Narrow"/>
           <w:b/>
@@ -1148,8 +1306,7 @@
           <w:sz w:val="22"/>
           <w:szCs w:val="22"/>
         </w:rPr>
-        <w:t xml:space="preserve">, </w:t>
-      </w:r>
+      </w:pPr>
       <w:r>
         <w:rPr>
           <w:rFonts w:ascii="Arial Narrow" w:hAnsi="Arial Narrow"/>
@@ -1158,7 +1315,7 @@
           <w:sz w:val="22"/>
           <w:szCs w:val="22"/>
         </w:rPr>
-        <w:t xml:space="preserve">dan </w:t>
+        <w:t>Widyaiswara, Alumni</w:t>
       </w:r>
       <w:r>
         <w:rPr>
@@ -1168,8 +1325,40 @@
           <w:sz w:val="22"/>
           <w:szCs w:val="22"/>
         </w:rPr>
+        <w:t xml:space="preserve">, </w:t>
+      </w:r>
+      <w:r>
+        <w:rPr>
+          <w:rFonts w:ascii="Arial Narrow" w:hAnsi="Arial Narrow"/>
+          <w:b/>
+          <w:bCs/>
+          <w:sz w:val="22"/>
+          <w:szCs w:val="22"/>
+        </w:rPr>
+        <w:t xml:space="preserve">dan </w:t>
+      </w:r>
+      <w:r>
+        <w:rPr>
+          <w:rFonts w:ascii="Arial Narrow" w:hAnsi="Arial Narrow"/>
+          <w:b/>
+          <w:bCs/>
+          <w:sz w:val="22"/>
+          <w:szCs w:val="22"/>
+        </w:rPr>
         <w:t>Tim Penjamin Mutu</w:t>
       </w:r>
+    </w:p>
+    <w:p>
+      <w:pPr>
+        <w:pStyle w:val="NormalWeb"/>
+        <w:spacing w:before="0" w:beforeAutospacing="0" w:after="0" w:afterAutospacing="0"/>
+        <w:jc w:val="center"/>
+        <w:rPr>
+          <w:rFonts w:ascii="Arial Narrow" w:hAnsi="Arial Narrow"/>
+          <w:sz w:val="22"/>
+          <w:szCs w:val="22"/>
+        </w:rPr>
+      </w:pPr>
     </w:p>
     <w:p>
       <w:pPr>
@@ -3438,19 +3627,7 @@
               <w:rPr>
                 <w:rFonts w:ascii="Arial Narrow" w:eastAsia="Arial Narrow" w:hAnsi="Arial Narrow" w:cs="Arial Narrow"/>
               </w:rPr>
-              <w:t>${note</w:t>
-            </w:r>
-            <w:r>
-              <w:rPr>
-                <w:rFonts w:ascii="Arial Narrow" w:eastAsia="Arial Narrow" w:hAnsi="Arial Narrow" w:cs="Arial Narrow"/>
-              </w:rPr>
-              <w:t>I</w:t>
-            </w:r>
-            <w:r>
-              <w:rPr>
-                <w:rFonts w:ascii="Arial Narrow" w:eastAsia="Arial Narrow" w:hAnsi="Arial Narrow" w:cs="Arial Narrow"/>
-              </w:rPr>
-              <w:t>}</w:t>
+              <w:t>${noteI}</w:t>
             </w:r>
           </w:p>
           <w:p>
@@ -3477,13 +3654,7 @@
               <w:rPr>
                 <w:rFonts w:ascii="Arial Narrow" w:eastAsia="Arial Narrow" w:hAnsi="Arial Narrow" w:cs="Arial Narrow"/>
               </w:rPr>
-              <w:t>item</w:t>
-            </w:r>
-            <w:r>
-              <w:rPr>
-                <w:rFonts w:ascii="Arial Narrow" w:eastAsia="Arial Narrow" w:hAnsi="Arial Narrow" w:cs="Arial Narrow"/>
-              </w:rPr>
-              <w:t>I</w:t>
+              <w:t>itemI</w:t>
             </w:r>
             <w:r>
               <w:rPr>
@@ -3544,19 +3715,7 @@
               <w:rPr>
                 <w:rFonts w:ascii="Arial Narrow" w:eastAsia="Arial Narrow" w:hAnsi="Arial Narrow" w:cs="Arial Narrow"/>
               </w:rPr>
-              <w:t>${note2</w:t>
-            </w:r>
-            <w:r>
-              <w:rPr>
-                <w:rFonts w:ascii="Arial Narrow" w:eastAsia="Arial Narrow" w:hAnsi="Arial Narrow" w:cs="Arial Narrow"/>
-              </w:rPr>
-              <w:t>I</w:t>
-            </w:r>
-            <w:r>
-              <w:rPr>
-                <w:rFonts w:ascii="Arial Narrow" w:eastAsia="Arial Narrow" w:hAnsi="Arial Narrow" w:cs="Arial Narrow"/>
-              </w:rPr>
-              <w:t>}</w:t>
+              <w:t>${note2I}</w:t>
             </w:r>
           </w:p>
           <w:p>
@@ -3583,13 +3742,7 @@
               <w:rPr>
                 <w:rFonts w:ascii="Arial Narrow" w:eastAsia="Arial Narrow" w:hAnsi="Arial Narrow" w:cs="Arial Narrow"/>
               </w:rPr>
-              <w:t>item2</w:t>
-            </w:r>
-            <w:r>
-              <w:rPr>
-                <w:rFonts w:ascii="Arial Narrow" w:eastAsia="Arial Narrow" w:hAnsi="Arial Narrow" w:cs="Arial Narrow"/>
-              </w:rPr>
-              <w:t>I</w:t>
+              <w:t>item2I</w:t>
             </w:r>
             <w:r>
               <w:rPr>
@@ -3617,13 +3770,7 @@
               <w:rPr>
                 <w:rFonts w:ascii="Arial Narrow" w:eastAsia="Arial Narrow" w:hAnsi="Arial Narrow" w:cs="Arial Narrow"/>
               </w:rPr>
-              <w:t>2</w:t>
-            </w:r>
-            <w:r>
-              <w:rPr>
-                <w:rFonts w:ascii="Arial Narrow" w:eastAsia="Arial Narrow" w:hAnsi="Arial Narrow" w:cs="Arial Narrow"/>
-              </w:rPr>
-              <w:t>I</w:t>
+              <w:t>2I</w:t>
             </w:r>
             <w:r>
               <w:rPr>
@@ -3722,19 +3869,7 @@
               <w:rPr>
                 <w:rFonts w:ascii="Arial Narrow" w:eastAsia="Arial Narrow" w:hAnsi="Arial Narrow" w:cs="Arial Narrow"/>
               </w:rPr>
-              <w:t>${note</w:t>
-            </w:r>
-            <w:r>
-              <w:rPr>
-                <w:rFonts w:ascii="Arial Narrow" w:eastAsia="Arial Narrow" w:hAnsi="Arial Narrow" w:cs="Arial Narrow"/>
-              </w:rPr>
-              <w:t>J</w:t>
-            </w:r>
-            <w:r>
-              <w:rPr>
-                <w:rFonts w:ascii="Arial Narrow" w:eastAsia="Arial Narrow" w:hAnsi="Arial Narrow" w:cs="Arial Narrow"/>
-              </w:rPr>
-              <w:t>}</w:t>
+              <w:t>${noteJ}</w:t>
             </w:r>
           </w:p>
           <w:p>
@@ -3761,13 +3896,7 @@
               <w:rPr>
                 <w:rFonts w:ascii="Arial Narrow" w:eastAsia="Arial Narrow" w:hAnsi="Arial Narrow" w:cs="Arial Narrow"/>
               </w:rPr>
-              <w:t>item</w:t>
-            </w:r>
-            <w:r>
-              <w:rPr>
-                <w:rFonts w:ascii="Arial Narrow" w:eastAsia="Arial Narrow" w:hAnsi="Arial Narrow" w:cs="Arial Narrow"/>
-              </w:rPr>
-              <w:t>J</w:t>
+              <w:t>itemJ</w:t>
             </w:r>
             <w:r>
               <w:rPr>
@@ -3828,19 +3957,7 @@
               <w:rPr>
                 <w:rFonts w:ascii="Arial Narrow" w:eastAsia="Arial Narrow" w:hAnsi="Arial Narrow" w:cs="Arial Narrow"/>
               </w:rPr>
-              <w:t>${note2</w:t>
-            </w:r>
-            <w:r>
-              <w:rPr>
-                <w:rFonts w:ascii="Arial Narrow" w:eastAsia="Arial Narrow" w:hAnsi="Arial Narrow" w:cs="Arial Narrow"/>
-              </w:rPr>
-              <w:t>J</w:t>
-            </w:r>
-            <w:r>
-              <w:rPr>
-                <w:rFonts w:ascii="Arial Narrow" w:eastAsia="Arial Narrow" w:hAnsi="Arial Narrow" w:cs="Arial Narrow"/>
-              </w:rPr>
-              <w:t>}</w:t>
+              <w:t>${note2J}</w:t>
             </w:r>
           </w:p>
           <w:p>
@@ -3867,13 +3984,7 @@
               <w:rPr>
                 <w:rFonts w:ascii="Arial Narrow" w:eastAsia="Arial Narrow" w:hAnsi="Arial Narrow" w:cs="Arial Narrow"/>
               </w:rPr>
-              <w:t>item2</w:t>
-            </w:r>
-            <w:r>
-              <w:rPr>
-                <w:rFonts w:ascii="Arial Narrow" w:eastAsia="Arial Narrow" w:hAnsi="Arial Narrow" w:cs="Arial Narrow"/>
-              </w:rPr>
-              <w:t>J</w:t>
+              <w:t>item2J</w:t>
             </w:r>
             <w:r>
               <w:rPr>
@@ -3901,13 +4012,7 @@
               <w:rPr>
                 <w:rFonts w:ascii="Arial Narrow" w:eastAsia="Arial Narrow" w:hAnsi="Arial Narrow" w:cs="Arial Narrow"/>
               </w:rPr>
-              <w:t>2</w:t>
-            </w:r>
-            <w:r>
-              <w:rPr>
-                <w:rFonts w:ascii="Arial Narrow" w:eastAsia="Arial Narrow" w:hAnsi="Arial Narrow" w:cs="Arial Narrow"/>
-              </w:rPr>
-              <w:t>J</w:t>
+              <w:t>2J</w:t>
             </w:r>
             <w:r>
               <w:rPr>
@@ -4006,19 +4111,7 @@
               <w:rPr>
                 <w:rFonts w:ascii="Arial Narrow" w:eastAsia="Arial Narrow" w:hAnsi="Arial Narrow" w:cs="Arial Narrow"/>
               </w:rPr>
-              <w:t>${note</w:t>
-            </w:r>
-            <w:r>
-              <w:rPr>
-                <w:rFonts w:ascii="Arial Narrow" w:eastAsia="Arial Narrow" w:hAnsi="Arial Narrow" w:cs="Arial Narrow"/>
-              </w:rPr>
-              <w:t>K</w:t>
-            </w:r>
-            <w:r>
-              <w:rPr>
-                <w:rFonts w:ascii="Arial Narrow" w:eastAsia="Arial Narrow" w:hAnsi="Arial Narrow" w:cs="Arial Narrow"/>
-              </w:rPr>
-              <w:t>}</w:t>
+              <w:t>${noteK}</w:t>
             </w:r>
           </w:p>
           <w:p>
@@ -4045,13 +4138,7 @@
               <w:rPr>
                 <w:rFonts w:ascii="Arial Narrow" w:eastAsia="Arial Narrow" w:hAnsi="Arial Narrow" w:cs="Arial Narrow"/>
               </w:rPr>
-              <w:t>item</w:t>
-            </w:r>
-            <w:r>
-              <w:rPr>
-                <w:rFonts w:ascii="Arial Narrow" w:eastAsia="Arial Narrow" w:hAnsi="Arial Narrow" w:cs="Arial Narrow"/>
-              </w:rPr>
-              <w:t>K</w:t>
+              <w:t>itemK</w:t>
             </w:r>
             <w:r>
               <w:rPr>
@@ -4112,19 +4199,7 @@
               <w:rPr>
                 <w:rFonts w:ascii="Arial Narrow" w:eastAsia="Arial Narrow" w:hAnsi="Arial Narrow" w:cs="Arial Narrow"/>
               </w:rPr>
-              <w:t>${note2</w:t>
-            </w:r>
-            <w:r>
-              <w:rPr>
-                <w:rFonts w:ascii="Arial Narrow" w:eastAsia="Arial Narrow" w:hAnsi="Arial Narrow" w:cs="Arial Narrow"/>
-              </w:rPr>
-              <w:t>K</w:t>
-            </w:r>
-            <w:r>
-              <w:rPr>
-                <w:rFonts w:ascii="Arial Narrow" w:eastAsia="Arial Narrow" w:hAnsi="Arial Narrow" w:cs="Arial Narrow"/>
-              </w:rPr>
-              <w:t>}</w:t>
+              <w:t>${note2K}</w:t>
             </w:r>
           </w:p>
           <w:p>
@@ -4151,13 +4226,7 @@
               <w:rPr>
                 <w:rFonts w:ascii="Arial Narrow" w:eastAsia="Arial Narrow" w:hAnsi="Arial Narrow" w:cs="Arial Narrow"/>
               </w:rPr>
-              <w:t>item2</w:t>
-            </w:r>
-            <w:r>
-              <w:rPr>
-                <w:rFonts w:ascii="Arial Narrow" w:eastAsia="Arial Narrow" w:hAnsi="Arial Narrow" w:cs="Arial Narrow"/>
-              </w:rPr>
-              <w:t>K</w:t>
+              <w:t>item2K</w:t>
             </w:r>
             <w:r>
               <w:rPr>
@@ -4185,13 +4254,7 @@
               <w:rPr>
                 <w:rFonts w:ascii="Arial Narrow" w:eastAsia="Arial Narrow" w:hAnsi="Arial Narrow" w:cs="Arial Narrow"/>
               </w:rPr>
-              <w:t>2</w:t>
-            </w:r>
-            <w:r>
-              <w:rPr>
-                <w:rFonts w:ascii="Arial Narrow" w:eastAsia="Arial Narrow" w:hAnsi="Arial Narrow" w:cs="Arial Narrow"/>
-              </w:rPr>
-              <w:t>K</w:t>
+              <w:t>2K</w:t>
             </w:r>
             <w:r>
               <w:rPr>
@@ -4282,19 +4345,7 @@
               <w:rPr>
                 <w:rFonts w:ascii="Arial Narrow" w:eastAsia="Arial Narrow" w:hAnsi="Arial Narrow" w:cs="Arial Narrow"/>
               </w:rPr>
-              <w:t>${note</w:t>
-            </w:r>
-            <w:r>
-              <w:rPr>
-                <w:rFonts w:ascii="Arial Narrow" w:eastAsia="Arial Narrow" w:hAnsi="Arial Narrow" w:cs="Arial Narrow"/>
-              </w:rPr>
-              <w:t>L</w:t>
-            </w:r>
-            <w:r>
-              <w:rPr>
-                <w:rFonts w:ascii="Arial Narrow" w:eastAsia="Arial Narrow" w:hAnsi="Arial Narrow" w:cs="Arial Narrow"/>
-              </w:rPr>
-              <w:t>}</w:t>
+              <w:t>${noteL}</w:t>
             </w:r>
           </w:p>
           <w:p>
@@ -4321,13 +4372,7 @@
               <w:rPr>
                 <w:rFonts w:ascii="Arial Narrow" w:eastAsia="Arial Narrow" w:hAnsi="Arial Narrow" w:cs="Arial Narrow"/>
               </w:rPr>
-              <w:t>item</w:t>
-            </w:r>
-            <w:r>
-              <w:rPr>
-                <w:rFonts w:ascii="Arial Narrow" w:eastAsia="Arial Narrow" w:hAnsi="Arial Narrow" w:cs="Arial Narrow"/>
-              </w:rPr>
-              <w:t>L</w:t>
+              <w:t>itemL</w:t>
             </w:r>
             <w:r>
               <w:rPr>
@@ -4388,19 +4433,7 @@
               <w:rPr>
                 <w:rFonts w:ascii="Arial Narrow" w:eastAsia="Arial Narrow" w:hAnsi="Arial Narrow" w:cs="Arial Narrow"/>
               </w:rPr>
-              <w:t>${note2</w:t>
-            </w:r>
-            <w:r>
-              <w:rPr>
-                <w:rFonts w:ascii="Arial Narrow" w:eastAsia="Arial Narrow" w:hAnsi="Arial Narrow" w:cs="Arial Narrow"/>
-              </w:rPr>
-              <w:t>L</w:t>
-            </w:r>
-            <w:r>
-              <w:rPr>
-                <w:rFonts w:ascii="Arial Narrow" w:eastAsia="Arial Narrow" w:hAnsi="Arial Narrow" w:cs="Arial Narrow"/>
-              </w:rPr>
-              <w:t>}</w:t>
+              <w:t>${note2L}</w:t>
             </w:r>
           </w:p>
           <w:p>
@@ -4427,13 +4460,7 @@
               <w:rPr>
                 <w:rFonts w:ascii="Arial Narrow" w:eastAsia="Arial Narrow" w:hAnsi="Arial Narrow" w:cs="Arial Narrow"/>
               </w:rPr>
-              <w:t>item2</w:t>
-            </w:r>
-            <w:r>
-              <w:rPr>
-                <w:rFonts w:ascii="Arial Narrow" w:eastAsia="Arial Narrow" w:hAnsi="Arial Narrow" w:cs="Arial Narrow"/>
-              </w:rPr>
-              <w:t>L</w:t>
+              <w:t>item2L</w:t>
             </w:r>
             <w:r>
               <w:rPr>
@@ -4461,13 +4488,7 @@
               <w:rPr>
                 <w:rFonts w:ascii="Arial Narrow" w:eastAsia="Arial Narrow" w:hAnsi="Arial Narrow" w:cs="Arial Narrow"/>
               </w:rPr>
-              <w:t>2</w:t>
-            </w:r>
-            <w:r>
-              <w:rPr>
-                <w:rFonts w:ascii="Arial Narrow" w:eastAsia="Arial Narrow" w:hAnsi="Arial Narrow" w:cs="Arial Narrow"/>
-              </w:rPr>
-              <w:t>L</w:t>
+              <w:t>2L</w:t>
             </w:r>
             <w:r>
               <w:rPr>
@@ -4588,7 +4609,7 @@
           <w:rFonts w:ascii="Arial Narrow" w:eastAsia="Times New Roman" w:hAnsi="Arial Narrow"/>
           <w:b/>
           <w:bCs/>
-          <w:color w:val="FF0000"/>
+          <w:color w:val="000000" w:themeColor="text1"/>
           <w:lang w:eastAsia="id-ID"/>
         </w:rPr>
         <w:t>${start</w:t>
@@ -4598,7 +4619,7 @@
           <w:rFonts w:ascii="Arial Narrow" w:eastAsia="Times New Roman" w:hAnsi="Arial Narrow"/>
           <w:b/>
           <w:bCs/>
-          <w:color w:val="FF0000"/>
+          <w:color w:val="000000" w:themeColor="text1"/>
           <w:lang w:eastAsia="id-ID"/>
         </w:rPr>
         <w:t>_r</w:t>
@@ -4608,7 +4629,7 @@
           <w:rFonts w:ascii="Arial Narrow" w:eastAsia="Times New Roman" w:hAnsi="Arial Narrow"/>
           <w:b/>
           <w:bCs/>
-          <w:color w:val="FF0000"/>
+          <w:color w:val="000000" w:themeColor="text1"/>
           <w:lang w:eastAsia="id-ID"/>
         </w:rPr>
         <w:t>eupload}</w:t>
@@ -4618,7 +4639,7 @@
           <w:rFonts w:ascii="Arial Narrow" w:eastAsia="Times New Roman" w:hAnsi="Arial Narrow"/>
           <w:b/>
           <w:bCs/>
-          <w:color w:val="FF0000"/>
+          <w:color w:val="000000" w:themeColor="text1"/>
           <w:lang w:eastAsia="id-ID"/>
         </w:rPr>
         <w:t xml:space="preserve"> s/d </w:t>
@@ -4628,7 +4649,7 @@
           <w:rFonts w:ascii="Arial Narrow" w:eastAsia="Times New Roman" w:hAnsi="Arial Narrow"/>
           <w:b/>
           <w:bCs/>
-          <w:color w:val="FF0000"/>
+          <w:color w:val="000000" w:themeColor="text1"/>
           <w:lang w:eastAsia="id-ID"/>
         </w:rPr>
         <w:t>${end</w:t>
@@ -4638,7 +4659,7 @@
           <w:rFonts w:ascii="Arial Narrow" w:eastAsia="Times New Roman" w:hAnsi="Arial Narrow"/>
           <w:b/>
           <w:bCs/>
-          <w:color w:val="FF0000"/>
+          <w:color w:val="000000" w:themeColor="text1"/>
           <w:lang w:eastAsia="id-ID"/>
         </w:rPr>
         <w:t>_r</w:t>
@@ -4648,7 +4669,7 @@
           <w:rFonts w:ascii="Arial Narrow" w:eastAsia="Times New Roman" w:hAnsi="Arial Narrow"/>
           <w:b/>
           <w:bCs/>
-          <w:color w:val="FF0000"/>
+          <w:color w:val="000000" w:themeColor="text1"/>
           <w:lang w:eastAsia="id-ID"/>
         </w:rPr>
         <w:t>eupload}</w:t>
@@ -4658,56 +4679,47 @@
           <w:rFonts w:ascii="Arial Narrow" w:eastAsia="Times New Roman" w:hAnsi="Arial Narrow"/>
           <w:b/>
           <w:bCs/>
-          <w:color w:val="FF0000"/>
+          <w:color w:val="000000" w:themeColor="text1"/>
           <w:lang w:eastAsia="id-ID"/>
         </w:rPr>
-        <w:t xml:space="preserve"> Pukul 23.59 WIB</w:t>
+        <w:t xml:space="preserve"> Pukul 23.59 WIB. Penilaian ulang akan dimulai </w:t>
       </w:r>
       <w:r>
         <w:rPr>
           <w:rFonts w:ascii="Arial Narrow" w:eastAsia="Times New Roman" w:hAnsi="Arial Narrow"/>
           <w:b/>
           <w:bCs/>
+          <w:color w:val="000000" w:themeColor="text1"/>
           <w:lang w:eastAsia="id-ID"/>
         </w:rPr>
-        <w:t xml:space="preserve">. Penilaian ulang akan dimulai </w:t>
+        <w:t>${start</w:t>
       </w:r>
       <w:r>
         <w:rPr>
           <w:rFonts w:ascii="Arial Narrow" w:eastAsia="Times New Roman" w:hAnsi="Arial Narrow"/>
           <w:b/>
           <w:bCs/>
-          <w:color w:val="FF0000"/>
+          <w:color w:val="000000" w:themeColor="text1"/>
           <w:lang w:eastAsia="id-ID"/>
         </w:rPr>
-        <w:t>${start</w:t>
+        <w:t>_r</w:t>
       </w:r>
       <w:r>
         <w:rPr>
           <w:rFonts w:ascii="Arial Narrow" w:eastAsia="Times New Roman" w:hAnsi="Arial Narrow"/>
           <w:b/>
           <w:bCs/>
-          <w:color w:val="FF0000"/>
+          <w:color w:val="000000" w:themeColor="text1"/>
           <w:lang w:eastAsia="id-ID"/>
         </w:rPr>
-        <w:t>_r</w:t>
+        <w:t>egrade}</w:t>
       </w:r>
       <w:r>
         <w:rPr>
           <w:rFonts w:ascii="Arial Narrow" w:eastAsia="Times New Roman" w:hAnsi="Arial Narrow"/>
           <w:b/>
           <w:bCs/>
-          <w:color w:val="FF0000"/>
-          <w:lang w:eastAsia="id-ID"/>
-        </w:rPr>
-        <w:t>egrade}</w:t>
-      </w:r>
-      <w:r>
-        <w:rPr>
-          <w:rFonts w:ascii="Arial Narrow" w:eastAsia="Times New Roman" w:hAnsi="Arial Narrow"/>
-          <w:b/>
-          <w:bCs/>
-          <w:color w:val="FF0000"/>
+          <w:color w:val="000000" w:themeColor="text1"/>
           <w:lang w:eastAsia="id-ID"/>
         </w:rPr>
         <w:t>.</w:t>
@@ -4735,7 +4747,7 @@
 </file>
 
 <file path=word/numbering.xml><?xml version="1.0" encoding="utf-8"?>
-<w:numbering xmlns:wpc="http://schemas.microsoft.com/office/word/2010/wordprocessingCanvas" xmlns:cx="http://schemas.microsoft.com/office/drawing/2014/chartex" xmlns:cx1="http://schemas.microsoft.com/office/drawing/2015/9/8/chartex" xmlns:cx2="http://schemas.microsoft.com/office/drawing/2015/10/21/chartex" xmlns:cx3="http://schemas.microsoft.com/office/drawing/2016/5/9/chartex" xmlns:cx4="http://schemas.microsoft.com/office/drawing/2016/5/10/chartex" xmlns:cx5="http://schemas.microsoft.com/office/drawing/2016/5/11/chartex" xmlns:cx6="http://schemas.microsoft.com/office/drawing/2016/5/12/chartex" xmlns:cx7="http://schemas.microsoft.com/office/drawing/2016/5/13/chartex" xmlns:cx8="http://schemas.microsoft.com/office/drawing/2016/5/14/chartex" xmlns:mc="http://schemas.openxmlformats.org/markup-compatibility/2006" xmlns:aink="http://schemas.microsoft.com/office/drawing/2016/ink" xmlns:am3d="http://schemas.microsoft.com/office/drawing/2017/model3d" xmlns:o="urn:schemas-microsoft-com:office:office" xmlns:oel="http://schemas.microsoft.com/office/2019/extlst" xmlns:r="http://schemas.openxmlformats.org/officeDocument/2006/relationships" xmlns:m="http://schemas.openxmlformats.org/officeDocument/2006/math" xmlns:v="urn:schemas-microsoft-com:vml" xmlns:wp14="http://schemas.microsoft.com/office/word/2010/wordprocessingDrawing" xmlns:wp="http://schemas.openxmlformats.org/drawingml/2006/wordprocessingDrawing" xmlns:w10="urn:schemas-microsoft-com:office:word" xmlns:w="http://schemas.openxmlformats.org/wordprocessingml/2006/main" xmlns:w14="http://schemas.microsoft.com/office/word/2010/wordml" xmlns:w15="http://schemas.microsoft.com/office/word/2012/wordml" xmlns:w16cex="http://schemas.microsoft.com/office/word/2018/wordml/cex" xmlns:w16cid="http://schemas.microsoft.com/office/word/2016/wordml/cid" xmlns:w16="http://schemas.microsoft.com/office/word/2018/wordml" xmlns:w16du="http://schemas.microsoft.com/office/word/2023/wordml/word16du" xmlns:w16sdtdh="http://schemas.microsoft.com/office/word/2020/wordml/sdtdatahash" xmlns:w16sdtfl="http://schemas.microsoft.com/office/word/2024/wordml/sdtformatlock" xmlns:w16se="http://schemas.microsoft.com/office/word/2015/wordml/symex" xmlns:wpg="http://schemas.microsoft.com/office/word/2010/wordprocessingGroup" xmlns:wpi="http://schemas.microsoft.com/office/word/2010/wordprocessingInk" xmlns:wne="http://schemas.microsoft.com/office/word/2006/wordml" xmlns:wps="http://schemas.microsoft.com/office/word/2010/wordprocessingShape" mc:Ignorable="w14 w15 w16se w16cid w16 w16cex w16sdtdh w16sdtfl w16du wp14">
+<w:numbering xmlns:wpc="http://schemas.microsoft.com/office/word/2010/wordprocessingCanvas" xmlns:cx="http://schemas.microsoft.com/office/drawing/2014/chartex" xmlns:cx1="http://schemas.microsoft.com/office/drawing/2015/9/8/chartex" xmlns:cx2="http://schemas.microsoft.com/office/drawing/2015/10/21/chartex" xmlns:cx3="http://schemas.microsoft.com/office/drawing/2016/5/9/chartex" xmlns:cx4="http://schemas.microsoft.com/office/drawing/2016/5/10/chartex" xmlns:cx5="http://schemas.microsoft.com/office/drawing/2016/5/11/chartex" xmlns:cx6="http://schemas.microsoft.com/office/drawing/2016/5/12/chartex" xmlns:cx7="http://schemas.microsoft.com/office/drawing/2016/5/13/chartex" xmlns:cx8="http://schemas.microsoft.com/office/drawing/2016/5/14/chartex" xmlns:mc="http://schemas.openxmlformats.org/markup-compatibility/2006" xmlns:m="http://schemas.openxmlformats.org/officeDocument/2006/math" xmlns:aink="http://schemas.microsoft.com/office/drawing/2016/ink" xmlns:am3d="http://schemas.microsoft.com/office/drawing/2017/model3d" xmlns:oel="http://schemas.microsoft.com/office/2019/extlst" xmlns:r="http://schemas.openxmlformats.org/officeDocument/2006/relationships" xmlns:wp14="http://schemas.microsoft.com/office/word/2010/wordprocessingDrawing" xmlns:wp="http://schemas.openxmlformats.org/drawingml/2006/wordprocessingDrawing" xmlns:wpg="http://schemas.microsoft.com/office/word/2010/wordprocessingGroup" xmlns:wpi="http://schemas.microsoft.com/office/word/2010/wordprocessingInk" xmlns:wps="http://schemas.microsoft.com/office/word/2010/wordprocessingShape" xmlns:o="urn:schemas-microsoft-com:office:office" xmlns:v="urn:schemas-microsoft-com:vml" xmlns:w10="urn:schemas-microsoft-com:office:word" xmlns:w="http://schemas.openxmlformats.org/wordprocessingml/2006/main" xmlns:w14="http://schemas.microsoft.com/office/word/2010/wordml" xmlns:w15="http://schemas.microsoft.com/office/word/2012/wordml" xmlns:w16cei="http://schemas.microsoft.com/office/word/2026/wordml/cei" xmlns:w16cex="http://schemas.microsoft.com/office/word/2018/wordml/cex" xmlns:w16cid="http://schemas.microsoft.com/office/word/2016/wordml/cid" xmlns:w16="http://schemas.microsoft.com/office/word/2018/wordml" xmlns:w16sdtdh="http://schemas.microsoft.com/office/word/2020/wordml/sdtdatahash" xmlns:w16sdtfl="http://schemas.microsoft.com/office/word/2024/wordml/sdtformatlock" xmlns:w16se="http://schemas.microsoft.com/office/word/2015/wordml/symex" xmlns:w16du="http://schemas.microsoft.com/office/word/2023/wordml/word16du" xmlns:wne="http://schemas.microsoft.com/office/word/2006/wordml" mc:Ignorable="w14 w15 w16se w16cid w16 w16cex w16sdtdh w16sdtfl w16du wp14">
   <w:abstractNum w:abstractNumId="0" w15:restartNumberingAfterBreak="0">
     <w:nsid w:val="09BB0851"/>
     <w:multiLevelType w:val="hybridMultilevel"/>
@@ -5892,6 +5904,96 @@
     </w:lvl>
   </w:abstractNum>
   <w:abstractNum w:abstractNumId="12" w15:restartNumberingAfterBreak="0">
+    <w:nsid w:val="3E545B11"/>
+    <w:multiLevelType w:val="hybridMultilevel"/>
+    <w:tmpl w:val="16C86BCC"/>
+    <w:lvl w:ilvl="0" w:tplc="D93ED696">
+      <w:start w:val="1"/>
+      <w:numFmt w:val="decimal"/>
+      <w:lvlText w:val="%1."/>
+      <w:lvlJc w:val="left"/>
+      <w:pPr>
+        <w:ind w:left="720" w:hanging="360"/>
+      </w:pPr>
+      <w:rPr>
+        <w:b w:val="0"/>
+        <w:bCs w:val="0"/>
+      </w:rPr>
+    </w:lvl>
+    <w:lvl w:ilvl="1" w:tplc="04090019" w:tentative="1">
+      <w:start w:val="1"/>
+      <w:numFmt w:val="lowerLetter"/>
+      <w:lvlText w:val="%2."/>
+      <w:lvlJc w:val="left"/>
+      <w:pPr>
+        <w:ind w:left="1440" w:hanging="360"/>
+      </w:pPr>
+    </w:lvl>
+    <w:lvl w:ilvl="2" w:tplc="0409001B" w:tentative="1">
+      <w:start w:val="1"/>
+      <w:numFmt w:val="lowerRoman"/>
+      <w:lvlText w:val="%3."/>
+      <w:lvlJc w:val="right"/>
+      <w:pPr>
+        <w:ind w:left="2160" w:hanging="180"/>
+      </w:pPr>
+    </w:lvl>
+    <w:lvl w:ilvl="3" w:tplc="0409000F" w:tentative="1">
+      <w:start w:val="1"/>
+      <w:numFmt w:val="decimal"/>
+      <w:lvlText w:val="%4."/>
+      <w:lvlJc w:val="left"/>
+      <w:pPr>
+        <w:ind w:left="2880" w:hanging="360"/>
+      </w:pPr>
+    </w:lvl>
+    <w:lvl w:ilvl="4" w:tplc="04090019" w:tentative="1">
+      <w:start w:val="1"/>
+      <w:numFmt w:val="lowerLetter"/>
+      <w:lvlText w:val="%5."/>
+      <w:lvlJc w:val="left"/>
+      <w:pPr>
+        <w:ind w:left="3600" w:hanging="360"/>
+      </w:pPr>
+    </w:lvl>
+    <w:lvl w:ilvl="5" w:tplc="0409001B" w:tentative="1">
+      <w:start w:val="1"/>
+      <w:numFmt w:val="lowerRoman"/>
+      <w:lvlText w:val="%6."/>
+      <w:lvlJc w:val="right"/>
+      <w:pPr>
+        <w:ind w:left="4320" w:hanging="180"/>
+      </w:pPr>
+    </w:lvl>
+    <w:lvl w:ilvl="6" w:tplc="0409000F" w:tentative="1">
+      <w:start w:val="1"/>
+      <w:numFmt w:val="decimal"/>
+      <w:lvlText w:val="%7."/>
+      <w:lvlJc w:val="left"/>
+      <w:pPr>
+        <w:ind w:left="5040" w:hanging="360"/>
+      </w:pPr>
+    </w:lvl>
+    <w:lvl w:ilvl="7" w:tplc="04090019" w:tentative="1">
+      <w:start w:val="1"/>
+      <w:numFmt w:val="lowerLetter"/>
+      <w:lvlText w:val="%8."/>
+      <w:lvlJc w:val="left"/>
+      <w:pPr>
+        <w:ind w:left="5760" w:hanging="360"/>
+      </w:pPr>
+    </w:lvl>
+    <w:lvl w:ilvl="8" w:tplc="0409001B" w:tentative="1">
+      <w:start w:val="1"/>
+      <w:numFmt w:val="lowerRoman"/>
+      <w:lvlText w:val="%9."/>
+      <w:lvlJc w:val="right"/>
+      <w:pPr>
+        <w:ind w:left="6480" w:hanging="180"/>
+      </w:pPr>
+    </w:lvl>
+  </w:abstractNum>
+  <w:abstractNum w:abstractNumId="13" w15:restartNumberingAfterBreak="0">
     <w:nsid w:val="46590190"/>
     <w:multiLevelType w:val="multilevel"/>
     <w:tmpl w:val="599C316C"/>
@@ -5980,7 +6082,7 @@
       </w:pPr>
     </w:lvl>
   </w:abstractNum>
-  <w:abstractNum w:abstractNumId="13" w15:restartNumberingAfterBreak="0">
+  <w:abstractNum w:abstractNumId="14" w15:restartNumberingAfterBreak="0">
     <w:nsid w:val="480C392B"/>
     <w:multiLevelType w:val="hybridMultilevel"/>
     <w:tmpl w:val="CDE08386"/>
@@ -6069,7 +6171,7 @@
       </w:pPr>
     </w:lvl>
   </w:abstractNum>
-  <w:abstractNum w:abstractNumId="14" w15:restartNumberingAfterBreak="0">
+  <w:abstractNum w:abstractNumId="15" w15:restartNumberingAfterBreak="0">
     <w:nsid w:val="554159DD"/>
     <w:multiLevelType w:val="hybridMultilevel"/>
     <w:tmpl w:val="62EA000C"/>
@@ -6182,7 +6284,7 @@
       </w:rPr>
     </w:lvl>
   </w:abstractNum>
-  <w:abstractNum w:abstractNumId="15" w15:restartNumberingAfterBreak="0">
+  <w:abstractNum w:abstractNumId="16" w15:restartNumberingAfterBreak="0">
     <w:nsid w:val="55DF2678"/>
     <w:multiLevelType w:val="hybridMultilevel"/>
     <w:tmpl w:val="FFAAC882"/>
@@ -6295,7 +6397,7 @@
       </w:rPr>
     </w:lvl>
   </w:abstractNum>
-  <w:abstractNum w:abstractNumId="16" w15:restartNumberingAfterBreak="0">
+  <w:abstractNum w:abstractNumId="17" w15:restartNumberingAfterBreak="0">
     <w:nsid w:val="5C253B2D"/>
     <w:multiLevelType w:val="hybridMultilevel"/>
     <w:tmpl w:val="A78E60EE"/>
@@ -6408,7 +6510,7 @@
       </w:rPr>
     </w:lvl>
   </w:abstractNum>
-  <w:abstractNum w:abstractNumId="17" w15:restartNumberingAfterBreak="0">
+  <w:abstractNum w:abstractNumId="18" w15:restartNumberingAfterBreak="0">
     <w:nsid w:val="5CB726F2"/>
     <w:multiLevelType w:val="hybridMultilevel"/>
     <w:tmpl w:val="AFACD82C"/>
@@ -6521,7 +6623,7 @@
       </w:rPr>
     </w:lvl>
   </w:abstractNum>
-  <w:abstractNum w:abstractNumId="18" w15:restartNumberingAfterBreak="0">
+  <w:abstractNum w:abstractNumId="19" w15:restartNumberingAfterBreak="0">
     <w:nsid w:val="5FB9171F"/>
     <w:multiLevelType w:val="hybridMultilevel"/>
     <w:tmpl w:val="CDE08386"/>
@@ -6610,7 +6712,7 @@
       </w:pPr>
     </w:lvl>
   </w:abstractNum>
-  <w:abstractNum w:abstractNumId="19" w15:restartNumberingAfterBreak="0">
+  <w:abstractNum w:abstractNumId="20" w15:restartNumberingAfterBreak="0">
     <w:nsid w:val="6403091D"/>
     <w:multiLevelType w:val="hybridMultilevel"/>
     <w:tmpl w:val="938E38F0"/>
@@ -6696,7 +6798,7 @@
       </w:pPr>
     </w:lvl>
   </w:abstractNum>
-  <w:abstractNum w:abstractNumId="20" w15:restartNumberingAfterBreak="0">
+  <w:abstractNum w:abstractNumId="21" w15:restartNumberingAfterBreak="0">
     <w:nsid w:val="6583178A"/>
     <w:multiLevelType w:val="hybridMultilevel"/>
     <w:tmpl w:val="30826BA2"/>
@@ -6786,7 +6888,7 @@
       </w:pPr>
     </w:lvl>
   </w:abstractNum>
-  <w:abstractNum w:abstractNumId="21" w15:restartNumberingAfterBreak="0">
+  <w:abstractNum w:abstractNumId="22" w15:restartNumberingAfterBreak="0">
     <w:nsid w:val="65F95ABB"/>
     <w:multiLevelType w:val="hybridMultilevel"/>
     <w:tmpl w:val="02B051C8"/>
@@ -6899,7 +7001,7 @@
       </w:rPr>
     </w:lvl>
   </w:abstractNum>
-  <w:abstractNum w:abstractNumId="22" w15:restartNumberingAfterBreak="0">
+  <w:abstractNum w:abstractNumId="23" w15:restartNumberingAfterBreak="0">
     <w:nsid w:val="676D1A04"/>
     <w:multiLevelType w:val="hybridMultilevel"/>
     <w:tmpl w:val="CDE08386"/>
@@ -6988,7 +7090,7 @@
       </w:pPr>
     </w:lvl>
   </w:abstractNum>
-  <w:abstractNum w:abstractNumId="23" w15:restartNumberingAfterBreak="0">
+  <w:abstractNum w:abstractNumId="24" w15:restartNumberingAfterBreak="0">
     <w:nsid w:val="69953CFF"/>
     <w:multiLevelType w:val="hybridMultilevel"/>
     <w:tmpl w:val="94561204"/>
@@ -7101,7 +7203,7 @@
       </w:rPr>
     </w:lvl>
   </w:abstractNum>
-  <w:abstractNum w:abstractNumId="24" w15:restartNumberingAfterBreak="0">
+  <w:abstractNum w:abstractNumId="25" w15:restartNumberingAfterBreak="0">
     <w:nsid w:val="6B974574"/>
     <w:multiLevelType w:val="hybridMultilevel"/>
     <w:tmpl w:val="7D2475FE"/>
@@ -7214,7 +7316,7 @@
       </w:rPr>
     </w:lvl>
   </w:abstractNum>
-  <w:abstractNum w:abstractNumId="25" w15:restartNumberingAfterBreak="0">
+  <w:abstractNum w:abstractNumId="26" w15:restartNumberingAfterBreak="0">
     <w:nsid w:val="6BA323C5"/>
     <w:multiLevelType w:val="hybridMultilevel"/>
     <w:tmpl w:val="7968F306"/>
@@ -7300,7 +7402,7 @@
       </w:pPr>
     </w:lvl>
   </w:abstractNum>
-  <w:abstractNum w:abstractNumId="26" w15:restartNumberingAfterBreak="0">
+  <w:abstractNum w:abstractNumId="27" w15:restartNumberingAfterBreak="0">
     <w:nsid w:val="70F25690"/>
     <w:multiLevelType w:val="hybridMultilevel"/>
     <w:tmpl w:val="37DAEF7A"/>
@@ -7413,7 +7515,7 @@
       </w:rPr>
     </w:lvl>
   </w:abstractNum>
-  <w:abstractNum w:abstractNumId="27" w15:restartNumberingAfterBreak="0">
+  <w:abstractNum w:abstractNumId="28" w15:restartNumberingAfterBreak="0">
     <w:nsid w:val="721906C4"/>
     <w:multiLevelType w:val="hybridMultilevel"/>
     <w:tmpl w:val="CDE08386"/>
@@ -7502,7 +7604,7 @@
       </w:pPr>
     </w:lvl>
   </w:abstractNum>
-  <w:abstractNum w:abstractNumId="28" w15:restartNumberingAfterBreak="0">
+  <w:abstractNum w:abstractNumId="29" w15:restartNumberingAfterBreak="0">
     <w:nsid w:val="7ECE7E89"/>
     <w:multiLevelType w:val="hybridMultilevel"/>
     <w:tmpl w:val="938E38F0"/>
@@ -7589,19 +7691,19 @@
     </w:lvl>
   </w:abstractNum>
   <w:num w:numId="1" w16cid:durableId="2054235183">
-    <w:abstractNumId w:val="20"/>
+    <w:abstractNumId w:val="21"/>
   </w:num>
   <w:num w:numId="2" w16cid:durableId="1417439320">
-    <w:abstractNumId w:val="13"/>
+    <w:abstractNumId w:val="14"/>
   </w:num>
   <w:num w:numId="3" w16cid:durableId="1348945553">
     <w:abstractNumId w:val="1"/>
   </w:num>
   <w:num w:numId="4" w16cid:durableId="756246366">
-    <w:abstractNumId w:val="27"/>
+    <w:abstractNumId w:val="28"/>
   </w:num>
   <w:num w:numId="5" w16cid:durableId="1423406263">
-    <w:abstractNumId w:val="18"/>
+    <w:abstractNumId w:val="19"/>
   </w:num>
   <w:num w:numId="6" w16cid:durableId="2082871199">
     <w:abstractNumId w:val="5"/>
@@ -7610,19 +7712,19 @@
     <w:abstractNumId w:val="3"/>
   </w:num>
   <w:num w:numId="8" w16cid:durableId="1846940063">
-    <w:abstractNumId w:val="22"/>
+    <w:abstractNumId w:val="23"/>
   </w:num>
   <w:num w:numId="9" w16cid:durableId="753863080">
     <w:abstractNumId w:val="11"/>
   </w:num>
   <w:num w:numId="10" w16cid:durableId="1300381963">
-    <w:abstractNumId w:val="12"/>
+    <w:abstractNumId w:val="13"/>
   </w:num>
   <w:num w:numId="11" w16cid:durableId="884608919">
-    <w:abstractNumId w:val="19"/>
+    <w:abstractNumId w:val="20"/>
   </w:num>
   <w:num w:numId="12" w16cid:durableId="953368883">
-    <w:abstractNumId w:val="28"/>
+    <w:abstractNumId w:val="29"/>
   </w:num>
   <w:num w:numId="13" w16cid:durableId="1595939337">
     <w:abstractNumId w:val="6"/>
@@ -7631,7 +7733,7 @@
     <w:abstractNumId w:val="10"/>
   </w:num>
   <w:num w:numId="15" w16cid:durableId="558513531">
-    <w:abstractNumId w:val="25"/>
+    <w:abstractNumId w:val="26"/>
   </w:num>
   <w:num w:numId="16" w16cid:durableId="1886747371">
     <w:abstractNumId w:val="0"/>
@@ -7643,28 +7745,28 @@
     <w:abstractNumId w:val="8"/>
   </w:num>
   <w:num w:numId="19" w16cid:durableId="1230535802">
+    <w:abstractNumId w:val="18"/>
+  </w:num>
+  <w:num w:numId="20" w16cid:durableId="1086269307">
     <w:abstractNumId w:val="17"/>
   </w:num>
-  <w:num w:numId="20" w16cid:durableId="1086269307">
-    <w:abstractNumId w:val="16"/>
-  </w:num>
   <w:num w:numId="21" w16cid:durableId="184561772">
-    <w:abstractNumId w:val="26"/>
+    <w:abstractNumId w:val="27"/>
   </w:num>
   <w:num w:numId="22" w16cid:durableId="1112557112">
-    <w:abstractNumId w:val="21"/>
+    <w:abstractNumId w:val="22"/>
   </w:num>
   <w:num w:numId="23" w16cid:durableId="1855460311">
-    <w:abstractNumId w:val="23"/>
+    <w:abstractNumId w:val="24"/>
   </w:num>
   <w:num w:numId="24" w16cid:durableId="494731675">
-    <w:abstractNumId w:val="14"/>
+    <w:abstractNumId w:val="15"/>
   </w:num>
   <w:num w:numId="25" w16cid:durableId="1180778438">
-    <w:abstractNumId w:val="24"/>
+    <w:abstractNumId w:val="25"/>
   </w:num>
   <w:num w:numId="26" w16cid:durableId="961572691">
-    <w:abstractNumId w:val="15"/>
+    <w:abstractNumId w:val="16"/>
   </w:num>
   <w:num w:numId="27" w16cid:durableId="487595161">
     <w:abstractNumId w:val="7"/>
@@ -7675,12 +7777,15 @@
   <w:num w:numId="29" w16cid:durableId="894848872">
     <w:abstractNumId w:val="2"/>
   </w:num>
+  <w:num w:numId="30" w16cid:durableId="343675319">
+    <w:abstractNumId w:val="12"/>
+  </w:num>
   <w:numIdMacAtCleanup w:val="23"/>
 </w:numbering>
 </file>
 
 <file path=word/styles.xml><?xml version="1.0" encoding="utf-8"?>
-<w:styles xmlns:mc="http://schemas.openxmlformats.org/markup-compatibility/2006" xmlns:r="http://schemas.openxmlformats.org/officeDocument/2006/relationships" xmlns:w="http://schemas.openxmlformats.org/wordprocessingml/2006/main" xmlns:w14="http://schemas.microsoft.com/office/word/2010/wordml" xmlns:w15="http://schemas.microsoft.com/office/word/2012/wordml" xmlns:w16cex="http://schemas.microsoft.com/office/word/2018/wordml/cex" xmlns:w16cid="http://schemas.microsoft.com/office/word/2016/wordml/cid" xmlns:w16="http://schemas.microsoft.com/office/word/2018/wordml" xmlns:w16du="http://schemas.microsoft.com/office/word/2023/wordml/word16du" xmlns:w16sdtdh="http://schemas.microsoft.com/office/word/2020/wordml/sdtdatahash" xmlns:w16sdtfl="http://schemas.microsoft.com/office/word/2024/wordml/sdtformatlock" xmlns:w16se="http://schemas.microsoft.com/office/word/2015/wordml/symex" mc:Ignorable="w14 w15 w16se w16cid w16 w16cex w16sdtdh w16sdtfl w16du">
+<w:styles xmlns:mc="http://schemas.openxmlformats.org/markup-compatibility/2006" xmlns:r="http://schemas.openxmlformats.org/officeDocument/2006/relationships" xmlns:w="http://schemas.openxmlformats.org/wordprocessingml/2006/main" xmlns:w14="http://schemas.microsoft.com/office/word/2010/wordml" xmlns:w15="http://schemas.microsoft.com/office/word/2012/wordml" xmlns:w16cex="http://schemas.microsoft.com/office/word/2018/wordml/cex" xmlns:w16cid="http://schemas.microsoft.com/office/word/2016/wordml/cid" xmlns:w16="http://schemas.microsoft.com/office/word/2018/wordml" xmlns:w16sdtdh="http://schemas.microsoft.com/office/word/2020/wordml/sdtdatahash" xmlns:w16sdtfl="http://schemas.microsoft.com/office/word/2024/wordml/sdtformatlock" xmlns:w16se="http://schemas.microsoft.com/office/word/2015/wordml/symex" xmlns:w16du="http://schemas.microsoft.com/office/word/2023/wordml/word16du" mc:Ignorable="w14 w15 w16se w16cid w16 w16cex w16sdtdh w16sdtfl w16du">
   <w:docDefaults>
     <w:rPrDefault>
       <w:rPr>

</xml_diff>